<commit_message>
chore: added remaining solution files and videos
</commit_message>
<xml_diff>
--- a/Documentation/ST10019838_DamianDare_PROG7312_Part1_Research.docx
+++ b/Documentation/ST10019838_DamianDare_PROG7312_Part1_Research.docx
@@ -144,7 +144,6 @@
         </w:rPr>
         <w:t xml:space="preserve"> </w:t>
       </w:r>
-      <w:proofErr w:type="spellStart"/>
       <w:r>
         <w:rPr>
           <w:rFonts w:ascii="Arial" w:hAnsi="Arial" w:cs="Arial"/>
@@ -154,7 +153,6 @@
         </w:rPr>
         <w:t>Nobubele</w:t>
       </w:r>
-      <w:proofErr w:type="spellEnd"/>
       <w:r>
         <w:rPr>
           <w:rFonts w:ascii="Arial" w:hAnsi="Arial" w:cs="Arial"/>
@@ -950,25 +948,7 @@
           <w:sz w:val="24"/>
           <w:szCs w:val="24"/>
         </w:rPr>
-        <w:t>(</w:t>
-      </w:r>
-      <w:proofErr w:type="spellStart"/>
-      <w:r>
-        <w:rPr>
-          <w:rFonts w:ascii="Arial" w:hAnsi="Arial" w:cs="Arial"/>
-          <w:sz w:val="24"/>
-          <w:szCs w:val="24"/>
-        </w:rPr>
-        <w:t>Userpilot</w:t>
-      </w:r>
-      <w:proofErr w:type="spellEnd"/>
-      <w:r>
-        <w:rPr>
-          <w:rFonts w:ascii="Arial" w:hAnsi="Arial" w:cs="Arial"/>
-          <w:sz w:val="24"/>
-          <w:szCs w:val="24"/>
-        </w:rPr>
-        <w:t xml:space="preserve">, 2024). </w:t>
+        <w:t xml:space="preserve">(Userpilot, 2024). </w:t>
       </w:r>
       <w:r>
         <w:rPr>
@@ -1080,25 +1060,7 @@
           <w:sz w:val="24"/>
           <w:szCs w:val="24"/>
         </w:rPr>
-        <w:t>, conversion rates, brand loyalty, and retention (</w:t>
-      </w:r>
-      <w:proofErr w:type="spellStart"/>
-      <w:r>
-        <w:rPr>
-          <w:rFonts w:ascii="Arial" w:hAnsi="Arial" w:cs="Arial"/>
-          <w:sz w:val="24"/>
-          <w:szCs w:val="24"/>
-        </w:rPr>
-        <w:t>Userpilot</w:t>
-      </w:r>
-      <w:proofErr w:type="spellEnd"/>
-      <w:r>
-        <w:rPr>
-          <w:rFonts w:ascii="Arial" w:hAnsi="Arial" w:cs="Arial"/>
-          <w:sz w:val="24"/>
-          <w:szCs w:val="24"/>
-        </w:rPr>
-        <w:t>, 2024).</w:t>
+        <w:t>, conversion rates, brand loyalty, and retention (Userpilot, 2024).</w:t>
       </w:r>
     </w:p>
     <w:p>
@@ -1199,27 +1161,7 @@
           <w:szCs w:val="24"/>
           <w:lang w:val="en-US"/>
         </w:rPr>
-        <w:t xml:space="preserve"> </w:t>
-      </w:r>
-      <w:proofErr w:type="spellStart"/>
-      <w:r>
-        <w:rPr>
-          <w:rFonts w:ascii="Arial" w:hAnsi="Arial" w:cs="Arial"/>
-          <w:sz w:val="24"/>
-          <w:szCs w:val="24"/>
-          <w:lang w:val="en-US"/>
-        </w:rPr>
-        <w:t>Userpilot</w:t>
-      </w:r>
-      <w:proofErr w:type="spellEnd"/>
-      <w:r>
-        <w:rPr>
-          <w:rFonts w:ascii="Arial" w:hAnsi="Arial" w:cs="Arial"/>
-          <w:sz w:val="24"/>
-          <w:szCs w:val="24"/>
-          <w:lang w:val="en-US"/>
-        </w:rPr>
-        <w:t xml:space="preserve"> (2024), </w:t>
+        <w:t xml:space="preserve"> Userpilot (2024), </w:t>
       </w:r>
       <w:r>
         <w:rPr>
@@ -1938,27 +1880,7 @@
           <w:szCs w:val="24"/>
           <w:lang w:val="en-US"/>
         </w:rPr>
-        <w:t xml:space="preserve">De </w:t>
-      </w:r>
-      <w:proofErr w:type="spellStart"/>
-      <w:r>
-        <w:rPr>
-          <w:rFonts w:ascii="Arial" w:hAnsi="Arial" w:cs="Arial"/>
-          <w:sz w:val="24"/>
-          <w:szCs w:val="24"/>
-          <w:lang w:val="en-US"/>
-        </w:rPr>
-        <w:t>Vor</w:t>
-      </w:r>
-      <w:proofErr w:type="spellEnd"/>
-      <w:r>
-        <w:rPr>
-          <w:rFonts w:ascii="Arial" w:hAnsi="Arial" w:cs="Arial"/>
-          <w:sz w:val="24"/>
-          <w:szCs w:val="24"/>
-          <w:lang w:val="en-US"/>
-        </w:rPr>
-        <w:t xml:space="preserve"> (2023)</w:t>
+        <w:t>De Vor (2023)</w:t>
       </w:r>
       <w:r>
         <w:rPr>
@@ -2130,25 +2052,7 @@
           <w:sz w:val="24"/>
           <w:szCs w:val="24"/>
         </w:rPr>
-        <w:t xml:space="preserve">onger user retention and more customer satisfaction (De </w:t>
-      </w:r>
-      <w:proofErr w:type="spellStart"/>
-      <w:r>
-        <w:rPr>
-          <w:rFonts w:ascii="Arial" w:hAnsi="Arial" w:cs="Arial"/>
-          <w:sz w:val="24"/>
-          <w:szCs w:val="24"/>
-        </w:rPr>
-        <w:t>Vor</w:t>
-      </w:r>
-      <w:proofErr w:type="spellEnd"/>
-      <w:r>
-        <w:rPr>
-          <w:rFonts w:ascii="Arial" w:hAnsi="Arial" w:cs="Arial"/>
-          <w:sz w:val="24"/>
-          <w:szCs w:val="24"/>
-        </w:rPr>
-        <w:t>, 2023).</w:t>
+        <w:t>onger user retention and more customer satisfaction (De Vor, 2023).</w:t>
       </w:r>
       <w:r>
         <w:rPr>
@@ -2309,25 +2213,7 @@
           <w:sz w:val="24"/>
           <w:szCs w:val="24"/>
         </w:rPr>
-        <w:t xml:space="preserve"> (De </w:t>
-      </w:r>
-      <w:proofErr w:type="spellStart"/>
-      <w:r>
-        <w:rPr>
-          <w:rFonts w:ascii="Arial" w:hAnsi="Arial" w:cs="Arial"/>
-          <w:sz w:val="24"/>
-          <w:szCs w:val="24"/>
-        </w:rPr>
-        <w:t>Vor</w:t>
-      </w:r>
-      <w:proofErr w:type="spellEnd"/>
-      <w:r>
-        <w:rPr>
-          <w:rFonts w:ascii="Arial" w:hAnsi="Arial" w:cs="Arial"/>
-          <w:sz w:val="24"/>
-          <w:szCs w:val="24"/>
-        </w:rPr>
-        <w:t xml:space="preserve">, 2023). Furthermore, this peer-to-peer </w:t>
+        <w:t xml:space="preserve"> (De Vor, 2023). Furthermore, this peer-to-peer </w:t>
       </w:r>
       <w:r>
         <w:rPr>
@@ -2359,25 +2245,7 @@
           <w:sz w:val="24"/>
           <w:szCs w:val="24"/>
         </w:rPr>
-        <w:t xml:space="preserve"> outside business hours (De </w:t>
-      </w:r>
-      <w:proofErr w:type="spellStart"/>
-      <w:r>
-        <w:rPr>
-          <w:rFonts w:ascii="Arial" w:hAnsi="Arial" w:cs="Arial"/>
-          <w:sz w:val="24"/>
-          <w:szCs w:val="24"/>
-        </w:rPr>
-        <w:t>Vor</w:t>
-      </w:r>
-      <w:proofErr w:type="spellEnd"/>
-      <w:r>
-        <w:rPr>
-          <w:rFonts w:ascii="Arial" w:hAnsi="Arial" w:cs="Arial"/>
-          <w:sz w:val="24"/>
-          <w:szCs w:val="24"/>
-        </w:rPr>
-        <w:t xml:space="preserve">, 2023). This speedy </w:t>
+        <w:t xml:space="preserve"> outside business hours (De Vor, 2023). This speedy </w:t>
       </w:r>
       <w:r>
         <w:rPr>
@@ -2393,25 +2261,7 @@
           <w:sz w:val="24"/>
           <w:szCs w:val="24"/>
         </w:rPr>
-        <w:t xml:space="preserve"> satisfies consumers while also improving the application's customer service (De </w:t>
-      </w:r>
-      <w:proofErr w:type="spellStart"/>
-      <w:r>
-        <w:rPr>
-          <w:rFonts w:ascii="Arial" w:hAnsi="Arial" w:cs="Arial"/>
-          <w:sz w:val="24"/>
-          <w:szCs w:val="24"/>
-        </w:rPr>
-        <w:t>Vor</w:t>
-      </w:r>
-      <w:proofErr w:type="spellEnd"/>
-      <w:r>
-        <w:rPr>
-          <w:rFonts w:ascii="Arial" w:hAnsi="Arial" w:cs="Arial"/>
-          <w:sz w:val="24"/>
-          <w:szCs w:val="24"/>
-        </w:rPr>
-        <w:t>, 2023).</w:t>
+        <w:t xml:space="preserve"> satisfies consumers while also improving the application's customer service (De Vor, 2023).</w:t>
       </w:r>
     </w:p>
     <w:p>
@@ -2513,27 +2363,7 @@
           <w:szCs w:val="24"/>
           <w:lang w:val="en-US"/>
         </w:rPr>
-        <w:t xml:space="preserve">, giving the development team an easy way to collect user-generated feedback (De </w:t>
-      </w:r>
-      <w:proofErr w:type="spellStart"/>
-      <w:r>
-        <w:rPr>
-          <w:rFonts w:ascii="Arial" w:hAnsi="Arial" w:cs="Arial"/>
-          <w:sz w:val="24"/>
-          <w:szCs w:val="24"/>
-          <w:lang w:val="en-US"/>
-        </w:rPr>
-        <w:t>Vor</w:t>
-      </w:r>
-      <w:proofErr w:type="spellEnd"/>
-      <w:r>
-        <w:rPr>
-          <w:rFonts w:ascii="Arial" w:hAnsi="Arial" w:cs="Arial"/>
-          <w:sz w:val="24"/>
-          <w:szCs w:val="24"/>
-          <w:lang w:val="en-US"/>
-        </w:rPr>
-        <w:t>, 2023).</w:t>
+        <w:t>, giving the development team an easy way to collect user-generated feedback (De Vor, 2023).</w:t>
       </w:r>
       <w:r>
         <w:rPr>
@@ -2569,27 +2399,7 @@
           <w:szCs w:val="24"/>
           <w:lang w:val="en-US"/>
         </w:rPr>
-        <w:t xml:space="preserve"> (De </w:t>
-      </w:r>
-      <w:proofErr w:type="spellStart"/>
-      <w:r>
-        <w:rPr>
-          <w:rFonts w:ascii="Arial" w:hAnsi="Arial" w:cs="Arial"/>
-          <w:sz w:val="24"/>
-          <w:szCs w:val="24"/>
-          <w:lang w:val="en-US"/>
-        </w:rPr>
-        <w:t>Vor</w:t>
-      </w:r>
-      <w:proofErr w:type="spellEnd"/>
-      <w:r>
-        <w:rPr>
-          <w:rFonts w:ascii="Arial" w:hAnsi="Arial" w:cs="Arial"/>
-          <w:sz w:val="24"/>
-          <w:szCs w:val="24"/>
-          <w:lang w:val="en-US"/>
-        </w:rPr>
-        <w:t>, 2023)</w:t>
+        <w:t xml:space="preserve"> (De Vor, 2023)</w:t>
       </w:r>
       <w:r>
         <w:rPr>
@@ -2747,27 +2557,7 @@
           <w:szCs w:val="24"/>
           <w:lang w:val="en-US"/>
         </w:rPr>
-        <w:t xml:space="preserve"> become loyal customers and advocates for the brand (De </w:t>
-      </w:r>
-      <w:proofErr w:type="spellStart"/>
-      <w:r>
-        <w:rPr>
-          <w:rFonts w:ascii="Arial" w:hAnsi="Arial" w:cs="Arial"/>
-          <w:sz w:val="24"/>
-          <w:szCs w:val="24"/>
-          <w:lang w:val="en-US"/>
-        </w:rPr>
-        <w:t>Vor</w:t>
-      </w:r>
-      <w:proofErr w:type="spellEnd"/>
-      <w:r>
-        <w:rPr>
-          <w:rFonts w:ascii="Arial" w:hAnsi="Arial" w:cs="Arial"/>
-          <w:sz w:val="24"/>
-          <w:szCs w:val="24"/>
-          <w:lang w:val="en-US"/>
-        </w:rPr>
-        <w:t xml:space="preserve">, 2023). These engaged community members </w:t>
+        <w:t xml:space="preserve"> become loyal customers and advocates for the brand (De Vor, 2023). These engaged community members </w:t>
       </w:r>
       <w:r>
         <w:rPr>
@@ -2821,27 +2611,7 @@
           <w:szCs w:val="24"/>
           <w:lang w:val="en-US"/>
         </w:rPr>
-        <w:t xml:space="preserve"> (De </w:t>
-      </w:r>
-      <w:proofErr w:type="spellStart"/>
-      <w:r>
-        <w:rPr>
-          <w:rFonts w:ascii="Arial" w:hAnsi="Arial" w:cs="Arial"/>
-          <w:sz w:val="24"/>
-          <w:szCs w:val="24"/>
-          <w:lang w:val="en-US"/>
-        </w:rPr>
-        <w:t>Vor</w:t>
-      </w:r>
-      <w:proofErr w:type="spellEnd"/>
-      <w:r>
-        <w:rPr>
-          <w:rFonts w:ascii="Arial" w:hAnsi="Arial" w:cs="Arial"/>
-          <w:sz w:val="24"/>
-          <w:szCs w:val="24"/>
-          <w:lang w:val="en-US"/>
-        </w:rPr>
-        <w:t>, 2023).</w:t>
+        <w:t xml:space="preserve"> (De Vor, 2023).</w:t>
       </w:r>
     </w:p>
     <w:p>
@@ -2963,27 +2733,7 @@
           <w:szCs w:val="24"/>
           <w:lang w:val="en-US"/>
         </w:rPr>
-        <w:t xml:space="preserve">with user preferences and needs (De </w:t>
-      </w:r>
-      <w:proofErr w:type="spellStart"/>
-      <w:r>
-        <w:rPr>
-          <w:rFonts w:ascii="Arial" w:hAnsi="Arial" w:cs="Arial"/>
-          <w:sz w:val="24"/>
-          <w:szCs w:val="24"/>
-          <w:lang w:val="en-US"/>
-        </w:rPr>
-        <w:t>Vor</w:t>
-      </w:r>
-      <w:proofErr w:type="spellEnd"/>
-      <w:r>
-        <w:rPr>
-          <w:rFonts w:ascii="Arial" w:hAnsi="Arial" w:cs="Arial"/>
-          <w:sz w:val="24"/>
-          <w:szCs w:val="24"/>
-          <w:lang w:val="en-US"/>
-        </w:rPr>
-        <w:t>, 2023).</w:t>
+        <w:t>with user preferences and needs (De Vor, 2023).</w:t>
       </w:r>
       <w:r>
         <w:rPr>
@@ -3019,27 +2769,7 @@
           <w:szCs w:val="24"/>
           <w:lang w:val="en-US"/>
         </w:rPr>
-        <w:t xml:space="preserve"> the sense of ownership and pride among users, leading to increased user engagement (De </w:t>
-      </w:r>
-      <w:proofErr w:type="spellStart"/>
-      <w:r>
-        <w:rPr>
-          <w:rFonts w:ascii="Arial" w:hAnsi="Arial" w:cs="Arial"/>
-          <w:sz w:val="24"/>
-          <w:szCs w:val="24"/>
-          <w:lang w:val="en-US"/>
-        </w:rPr>
-        <w:t>Vor</w:t>
-      </w:r>
-      <w:proofErr w:type="spellEnd"/>
-      <w:r>
-        <w:rPr>
-          <w:rFonts w:ascii="Arial" w:hAnsi="Arial" w:cs="Arial"/>
-          <w:sz w:val="24"/>
-          <w:szCs w:val="24"/>
-          <w:lang w:val="en-US"/>
-        </w:rPr>
-        <w:t>, 2023).</w:t>
+        <w:t xml:space="preserve"> the sense of ownership and pride among users, leading to increased user engagement (De Vor, 2023).</w:t>
       </w:r>
     </w:p>
     <w:p>
@@ -3277,25 +3007,25 @@
           <w:szCs w:val="24"/>
           <w:lang w:val="en-US"/>
         </w:rPr>
-        <w:t xml:space="preserve">Firstly, it will increase the visibility and understanding of issues whilst empowering communities to have their say over decisions; secondly, it enables community members to contribute to public decision-making processes; thirdly, government and public decision-making organizations </w:t>
-      </w:r>
-      <w:r>
-        <w:rPr>
-          <w:rFonts w:ascii="Arial" w:hAnsi="Arial" w:cs="Arial"/>
-          <w:sz w:val="24"/>
-          <w:szCs w:val="24"/>
-          <w:lang w:val="en-US"/>
-        </w:rPr>
-        <w:t xml:space="preserve">will be able </w:t>
-      </w:r>
-      <w:r>
-        <w:rPr>
-          <w:rFonts w:ascii="Arial" w:hAnsi="Arial" w:cs="Arial"/>
-          <w:sz w:val="24"/>
-          <w:szCs w:val="24"/>
-          <w:lang w:val="en-US"/>
-        </w:rPr>
-        <w:t>to listen and demonstrate the impact of community contribution; and lastly, it will enable deeper, stronger and more trusting relationships to be built between the municipality and its citizens (Granicus, n.d.).</w:t>
+        <w:t>Firstly, it will increase the visibility and understanding of issues whilst empowering communities to have their say over decisions; secondly, it enables community members to contribute to</w:t>
+      </w:r>
+      <w:r>
+        <w:rPr>
+          <w:rFonts w:ascii="Arial" w:hAnsi="Arial" w:cs="Arial"/>
+          <w:sz w:val="24"/>
+          <w:szCs w:val="24"/>
+          <w:lang w:val="en-US"/>
+        </w:rPr>
+        <w:t xml:space="preserve"> the</w:t>
+      </w:r>
+      <w:r>
+        <w:rPr>
+          <w:rFonts w:ascii="Arial" w:hAnsi="Arial" w:cs="Arial"/>
+          <w:sz w:val="24"/>
+          <w:szCs w:val="24"/>
+          <w:lang w:val="en-US"/>
+        </w:rPr>
+        <w:t xml:space="preserve"> public decision-making processes; thirdly, government and public decision-making organizations will be able to listen and demonstrate the impact of community contribution; and lastly, it will enable deeper, stronger and more trusting relationships to be built between the municipality and its citizens (Granicus, n.d.).</w:t>
       </w:r>
     </w:p>
     <w:p>
@@ -3575,23 +3305,13 @@
           <w:szCs w:val="24"/>
         </w:rPr>
       </w:pPr>
-      <w:proofErr w:type="spellStart"/>
-      <w:r>
-        <w:rPr>
-          <w:rFonts w:ascii="Arial" w:hAnsi="Arial" w:cs="Arial"/>
-          <w:sz w:val="24"/>
-          <w:szCs w:val="24"/>
-        </w:rPr>
-        <w:t>MoldStud</w:t>
-      </w:r>
-      <w:proofErr w:type="spellEnd"/>
-      <w:r>
-        <w:rPr>
-          <w:rFonts w:ascii="Arial" w:hAnsi="Arial" w:cs="Arial"/>
-          <w:sz w:val="24"/>
-          <w:szCs w:val="24"/>
-        </w:rPr>
-        <w:t xml:space="preserve"> (2024) suggests numerous techniques to </w:t>
+      <w:r>
+        <w:rPr>
+          <w:rFonts w:ascii="Arial" w:hAnsi="Arial" w:cs="Arial"/>
+          <w:sz w:val="24"/>
+          <w:szCs w:val="24"/>
+        </w:rPr>
+        <w:t xml:space="preserve">MoldStud (2024) suggests numerous techniques to </w:t>
       </w:r>
       <w:r>
         <w:rPr>
@@ -4276,18 +3996,8 @@
           <w:sz w:val="24"/>
           <w:szCs w:val="24"/>
         </w:rPr>
-        <w:t xml:space="preserve">De </w:t>
-      </w:r>
-      <w:proofErr w:type="spellStart"/>
-      <w:r>
-        <w:rPr>
-          <w:rFonts w:ascii="Arial" w:hAnsi="Arial" w:cs="Arial"/>
-          <w:sz w:val="24"/>
-          <w:szCs w:val="24"/>
-        </w:rPr>
-        <w:t>Vor</w:t>
-      </w:r>
-      <w:proofErr w:type="spellEnd"/>
+        <w:t>De Vor</w:t>
+      </w:r>
       <w:r>
         <w:rPr>
           <w:rFonts w:ascii="Arial" w:hAnsi="Arial" w:cs="Arial"/>
@@ -4458,16 +4168,7 @@
           <w:sz w:val="24"/>
           <w:szCs w:val="24"/>
         </w:rPr>
-        <w:t xml:space="preserve">Why is Community Engagement </w:t>
-      </w:r>
-      <w:proofErr w:type="gramStart"/>
-      <w:r>
-        <w:rPr>
-          <w:rFonts w:ascii="Arial" w:hAnsi="Arial" w:cs="Arial"/>
-          <w:sz w:val="24"/>
-          <w:szCs w:val="24"/>
-        </w:rPr>
-        <w:t>Important?</w:t>
+        <w:t>Why is Community Engagement Important?</w:t>
       </w:r>
       <w:r>
         <w:rPr>
@@ -4477,7 +4178,6 @@
         </w:rPr>
         <w:t>,</w:t>
       </w:r>
-      <w:proofErr w:type="gramEnd"/>
       <w:r>
         <w:rPr>
           <w:rFonts w:ascii="Arial" w:hAnsi="Arial" w:cs="Arial"/>
@@ -4670,7 +4370,6 @@
           <w:szCs w:val="24"/>
         </w:rPr>
       </w:pPr>
-      <w:proofErr w:type="spellStart"/>
       <w:r>
         <w:rPr>
           <w:rFonts w:ascii="Arial" w:hAnsi="Arial" w:cs="Arial"/>
@@ -4679,7 +4378,6 @@
         </w:rPr>
         <w:t>MoldStud</w:t>
       </w:r>
-      <w:proofErr w:type="spellEnd"/>
       <w:r>
         <w:rPr>
           <w:rFonts w:ascii="Arial" w:hAnsi="Arial" w:cs="Arial"/>
@@ -4780,7 +4478,6 @@
           <w:szCs w:val="24"/>
         </w:rPr>
       </w:pPr>
-      <w:proofErr w:type="spellStart"/>
       <w:r>
         <w:rPr>
           <w:rFonts w:ascii="Arial" w:hAnsi="Arial" w:cs="Arial"/>
@@ -4789,7 +4486,6 @@
         </w:rPr>
         <w:t>Userpilot</w:t>
       </w:r>
-      <w:proofErr w:type="spellEnd"/>
       <w:r>
         <w:rPr>
           <w:rFonts w:ascii="Arial" w:hAnsi="Arial" w:cs="Arial"/>

</xml_diff>